<commit_message>
Script di manutenzione allineati al vault; Registro art.30 e DPIA v1.1; procedura backup cifrati
</commit_message>
<xml_diff>
--- a/legal/DPIA_Salute_Profilazione_Minori_IT.docx
+++ b/legal/DPIA_Salute_Profilazione_Minori_IT.docx
@@ -42,7 +42,7 @@
           <w:sz w:val="20"/>
           <w:szCs w:val="20"/>
         </w:rPr>
-        <w:t xml:space="preserve">Ultimo aggiornamento: 21 luglio 2026 · Versione 1.0</w:t>
+        <w:t>Ultimo aggiornamento: 21 settembre 2026 · Versione 1.1</w:t>
       </w:r>
     </w:p>
     <w:p>
@@ -323,17 +323,7 @@
         <w:spacing w:after="80" w:line="300"/>
       </w:pPr>
       <w:r>
-        <w:t xml:space="preserve"/>
-      </w:r>
-      <w:r>
-        <w:rPr>
-          <w:b/>
-          <w:bCs/>
-        </w:rPr>
-        <w:t xml:space="preserve">Minimizzazione</w:t>
-      </w:r>
-      <w:r>
-        <w:t xml:space="preserve">: raccolta limitata ai dati funzionali; parametri opzionali chiaramente indicati; possibilità di disattivare feature IA.</w:t>
+        <w:t>Minimizzazione: raccolta limitata ai dati funzionali; parametri opzionali chiaramente indicati; possibilità di disattivare feature IA. Dal 21/09/2026 i dati identificativi degli atleti sono separati strutturalmente dai dati sanitari: nome, cognome, data di nascita, email e foto risiedono in una tabella dedicata, mentre infortuni, wellness e carichi sono collegati al solo identificativo tecnico. Per le finalita' di analisi e reportistica si opera su dati che non consentono di risalire alla persona senza un accesso ulteriore, riservato all'applicativo.</w:t>
       </w:r>
     </w:p>
     <w:p>
@@ -638,7 +628,7 @@
                 <w:sz w:val="19"/>
                 <w:szCs w:val="19"/>
               </w:rPr>
-              <w:t xml:space="preserve">Cifratura a riposo; MFA per staff; RBAC; audit; piano incident response con notifica 72h.</w:t>
+              <w:t>Cifratura a riposo; MFA per staff; RBAC; audit; piano incident response con notifica 72h. Dal 21/09/2026 separazione strutturale delle identità (pseudonimizzazione ex art. 32(1)(a)): i dati sanitari non contengono dati identificativi e il ruolo di reportistica non ha accesso alla tabella delle identità. Un accesso non autorizzato limitato ai soli dati clinici non consente di per sé l'identificazione degli interessati.</w:t>
             </w:r>
           </w:p>
         </w:tc>
@@ -1389,6 +1379,15 @@
       </w:r>
       <w:r>
         <w:t xml:space="preserve"> e non richiede consultazione preventiva del Garante ex art. 36 GDPR. La valutazione sarà riesaminata: (i) prima del lancio delle funzionalità di IA generativa aggiuntive; (ii) al superamento di soglie utenti significative; (iii) in caso di modifiche sostanziali; (iv) annualmente.</w:t>
+      </w:r>
+    </w:p>
+    <w:p>
+      <w:pPr>
+        <w:spacing w:after="140" w:line="300"/>
+        <w:jc w:val="both"/>
+      </w:pPr>
+      <w:r>
+        <w:t>Aggiornamento del 21 settembre 2026: è stata introdotta in produzione la separazione strutturale delle identità degli atleti e la de-identificazione dei prompt inviati ai fornitori di modelli IA. La misura incide sui rischi R1 (accesso non autorizzato a dati salute) e R3 (uso dei dati per training di modelli terzi); la rivalutazione dei rispettivi livelli di probabilità e gravità è rimessa al Titolare in sede di prossimo riesame. Resta fermo che i dati pseudonimizzati restano dati personali ai sensi del Considerando 26 GDPR e che la misura non sostituisce le altre garanzie qui documentate.</w:t>
       </w:r>
     </w:p>
     <w:p>

</xml_diff>

<commit_message>
IONOS conferma assenza di cifratura a riposo sui volumi VPS: DPIA v1.2 e Registro v1.3 corretti, piano cifratura riponderato
</commit_message>
<xml_diff>
--- a/legal/DPIA_Salute_Profilazione_Minori_IT.docx
+++ b/legal/DPIA_Salute_Profilazione_Minori_IT.docx
@@ -42,7 +42,7 @@
           <w:sz w:val="20"/>
           <w:szCs w:val="20"/>
         </w:rPr>
-        <w:t>Ultimo aggiornamento: 21 settembre 2026 · Versione 1.1</w:t>
+        <w:t>Ultimo aggiornamento: 22 settembre 2026 · Versione 1.2</w:t>
       </w:r>
     </w:p>
     <w:p>
@@ -628,7 +628,7 @@
                 <w:sz w:val="19"/>
                 <w:szCs w:val="19"/>
               </w:rPr>
-              <w:t>Cifratura a riposo; MFA per staff; RBAC; audit; piano incident response con notifica 72h. Dal 21/09/2026 separazione strutturale delle identità (pseudonimizzazione ex art. 32(1)(a)): i dati sanitari non contengono dati identificativi e il ruolo di reportistica non ha accesso alla tabella delle identità. Un accesso non autorizzato limitato ai soli dati clinici non consente di per sé l'identificazione degli interessati.</w:t>
+              <w:t>MFA per staff; RBAC; audit; piano incident response con notifica 72h. Separazione strutturale delle identità (pseudonimizzazione ex art. 32(1)(a)), attiva dal 21/09/2026: i dati sanitari non contengono dati identificativi e il ruolo di reportistica non ha accesso alla tabella delle identità, per cui un accesso non autorizzato ai soli dati clinici non consente di per sé l'identificazione degli interessati. Backup del database cifrati (AES-256) e verificati automaticamente a ogni esecuzione. NON è presente cifratura a riposo a livello di volume: il fornitore hosting ha confermato per iscritto in data 22/09/2026 che tale funzionalità non è attiva per impostazione predefinita sul prodotto in uso e sarebbe a carico del Titolare. La cifratura applicativa delle colonne identificative è pianificata e non ancora attiva.</w:t>
             </w:r>
           </w:p>
         </w:tc>
@@ -1240,7 +1240,7 @@
                 <w:sz w:val="19"/>
                 <w:szCs w:val="19"/>
               </w:rPr>
-              <w:t xml:space="preserve">Backup cifrati con test di restore; rotazione ≤ 90 gg; DR plan.</w:t>
+              <w:t>Backup automatico notturno cifrato, con verifica di integrità e di leggibilità a ogni esecuzione e conservazione di 14 copie; rotazione. Copia fuori dal server a cura del Titolare, attualmente manuale. Prova di ripristino completo non ancora eseguita.</w:t>
             </w:r>
           </w:p>
         </w:tc>
@@ -1388,6 +1388,15 @@
       </w:pPr>
       <w:r>
         <w:t>Aggiornamento del 21 settembre 2026: è stata introdotta in produzione la separazione strutturale delle identità degli atleti e la de-identificazione dei prompt inviati ai fornitori di modelli IA. La misura incide sui rischi R1 (accesso non autorizzato a dati salute) e R3 (uso dei dati per training di modelli terzi); la rivalutazione dei rispettivi livelli di probabilità e gravità è rimessa al Titolare in sede di prossimo riesame. Resta fermo che i dati pseudonimizzati restano dati personali ai sensi del Considerando 26 GDPR e che la misura non sostituisce le altre garanzie qui documentate.</w:t>
+      </w:r>
+    </w:p>
+    <w:p>
+      <w:pPr>
+        <w:spacing w:after="140" w:line="300"/>
+        <w:jc w:val="both"/>
+      </w:pPr>
+      <w:r>
+        <w:t>Precisazione del 22 settembre 2026: a seguito di richiesta scritta, il fornitore hosting ha confermato che i volumi del VPS non sono cifrati a riposo per impostazione predefinita. La precedente menzione della cifratura a riposo fra le mitigazioni del rischio R1 è stata pertanto rimossa e sostituita con le misure effettivamente in essere. Ne consegue che, allo stato, la riservatezza dei dati identificativi rispetto a un accesso a livello di supporto di memorizzazione è affidata alla sola separazione strutturale delle identità: circostanza che eleva la priorità della cifratura applicativa delle colonne identificative.</w:t>
       </w:r>
     </w:p>
     <w:p>

</xml_diff>